<commit_message>
feat(reports): add DDS fields to RDO template
</commit_message>
<xml_diff>
--- a/Modelos/definitivos/Modelo definitivo.docx
+++ b/Modelos/definitivos/Modelo definitivo.docx
@@ -1204,6 +1204,320 @@
                 <w:szCs w:val="18"/>
               </w:rPr>
               <w:t>}}</w:t>
+            </w:r>
+          </w:p>
+        </w:tc>
+      </w:tr>
+    </w:tbl>
+    <w:p>
+      <w:pPr>
+        <w:jc w:val="both"/>
+        <w:rPr>
+          <w:sz w:val="18"/>
+          <w:szCs w:val="18"/>
+        </w:rPr>
+      </w:pPr>
+    </w:p>
+    <w:tbl>
+      <w:tblPr>
+        <w:tblStyle w:val="Tabelacomgrade"/>
+        <w:tblW w:w="10348" w:type="dxa"/>
+        <w:jc w:val="center"/>
+        <w:tblLayout w:type="fixed"/>
+        <w:tblLook w:val="04A0" w:firstRow="1" w:lastRow="0" w:firstColumn="1" w:lastColumn="0" w:noHBand="0" w:noVBand="1"/>
+      </w:tblPr>
+      <w:tblGrid>
+        <w:gridCol w:w="2587"/>
+        <w:gridCol w:w="2587"/>
+        <w:gridCol w:w="2587"/>
+        <w:gridCol w:w="2587"/>
+      </w:tblGrid>
+      <w:tr>
+        <w:trPr>
+          <w:trHeight w:val="386"/>
+          <w:jc w:val="center"/>
+        </w:trPr>
+        <w:tc>
+          <w:tcPr>
+            <w:tcW w:w="10348" w:type="dxa"/>
+            <w:gridSpan w:val="4"/>
+            <w:shd w:val="clear" w:color="auto" w:fill="30503A"/>
+            <w:vAlign w:val="center"/>
+          </w:tcPr>
+          <w:p>
+            <w:pPr>
+              <w:jc w:val="center"/>
+              <w:rPr>
+                <w:b/>
+                <w:bCs/>
+                <w:color w:val="E8E8E8"/>
+                <w:sz w:val="20"/>
+                <w:szCs w:val="20"/>
+              </w:rPr>
+            </w:pPr>
+            <w:r>
+              <w:rPr>
+                <w:b/>
+                <w:bCs/>
+                <w:color w:val="E8E8E8"/>
+                <w:sz w:val="20"/>
+                <w:szCs w:val="20"/>
+              </w:rPr>
+              <w:t>DDS – DIÁLOGO DIÁRIO DE SEGURANÇA</w:t>
+            </w:r>
+          </w:p>
+        </w:tc>
+      </w:tr>
+      <w:tr>
+        <w:trPr>
+          <w:trHeight w:val="136"/>
+          <w:jc w:val="center"/>
+        </w:trPr>
+        <w:tc>
+          <w:tcPr>
+            <w:tcW w:w="5174" w:type="dxa"/>
+            <w:gridSpan w:val="2"/>
+            <w:shd w:val="clear" w:color="auto" w:fill="E8E8E8"/>
+          </w:tcPr>
+          <w:p>
+            <w:pPr>
+              <w:jc w:val="center"/>
+              <w:rPr>
+                <w:b/>
+                <w:bCs/>
+                <w:sz w:val="18"/>
+                <w:szCs w:val="18"/>
+              </w:rPr>
+            </w:pPr>
+            <w:r>
+              <w:rPr>
+                <w:b/>
+                <w:bCs/>
+                <w:sz w:val="18"/>
+                <w:szCs w:val="18"/>
+              </w:rPr>
+              <w:t>Turno Diurno</w:t>
+            </w:r>
+          </w:p>
+        </w:tc>
+        <w:tc>
+          <w:tcPr>
+            <w:tcW w:w="5174" w:type="dxa"/>
+            <w:gridSpan w:val="2"/>
+            <w:shd w:val="clear" w:color="auto" w:fill="E8E8E8"/>
+          </w:tcPr>
+          <w:p>
+            <w:pPr>
+              <w:jc w:val="center"/>
+              <w:rPr>
+                <w:b/>
+                <w:bCs/>
+                <w:sz w:val="18"/>
+                <w:szCs w:val="18"/>
+              </w:rPr>
+            </w:pPr>
+            <w:r>
+              <w:rPr>
+                <w:b/>
+                <w:bCs/>
+                <w:sz w:val="18"/>
+                <w:szCs w:val="18"/>
+              </w:rPr>
+              <w:t>Turno Noturno</w:t>
+            </w:r>
+          </w:p>
+        </w:tc>
+      </w:tr>
+      <w:tr>
+        <w:trPr>
+          <w:trHeight w:val="97"/>
+          <w:jc w:val="center"/>
+        </w:trPr>
+        <w:tc>
+          <w:tcPr>
+            <w:tcW w:w="2587" w:type="dxa"/>
+          </w:tcPr>
+          <w:p>
+            <w:pPr>
+              <w:rPr>
+                <w:sz w:val="18"/>
+                <w:szCs w:val="18"/>
+              </w:rPr>
+            </w:pPr>
+            <w:r>
+              <w:rPr>
+                <w:b/>
+                <w:bCs/>
+                <w:sz w:val="18"/>
+                <w:szCs w:val="18"/>
+              </w:rPr>
+              <w:t xml:space="preserve">Início: </w:t>
+            </w:r>
+            <w:r>
+              <w:rPr>
+                <w:color w:val="11437E"/>
+                <w:sz w:val="18"/>
+                <w:szCs w:val="18"/>
+              </w:rPr>
+              <w:t>{{ddsdaystart}}</w:t>
+            </w:r>
+          </w:p>
+        </w:tc>
+        <w:tc>
+          <w:tcPr>
+            <w:tcW w:w="2587" w:type="dxa"/>
+          </w:tcPr>
+          <w:p>
+            <w:pPr>
+              <w:rPr>
+                <w:sz w:val="18"/>
+                <w:szCs w:val="18"/>
+              </w:rPr>
+            </w:pPr>
+            <w:r>
+              <w:rPr>
+                <w:b/>
+                <w:bCs/>
+                <w:sz w:val="18"/>
+                <w:szCs w:val="18"/>
+              </w:rPr>
+              <w:t xml:space="preserve">Término: </w:t>
+            </w:r>
+            <w:r>
+              <w:rPr>
+                <w:color w:val="11437E"/>
+                <w:sz w:val="18"/>
+                <w:szCs w:val="18"/>
+              </w:rPr>
+              <w:t>{{ddsdayend}}</w:t>
+            </w:r>
+          </w:p>
+        </w:tc>
+        <w:tc>
+          <w:tcPr>
+            <w:tcW w:w="2587" w:type="dxa"/>
+          </w:tcPr>
+          <w:p>
+            <w:pPr>
+              <w:rPr>
+                <w:sz w:val="18"/>
+                <w:szCs w:val="18"/>
+              </w:rPr>
+            </w:pPr>
+            <w:r>
+              <w:rPr>
+                <w:b/>
+                <w:bCs/>
+                <w:sz w:val="18"/>
+                <w:szCs w:val="18"/>
+              </w:rPr>
+              <w:t xml:space="preserve">Início: </w:t>
+            </w:r>
+            <w:r>
+              <w:rPr>
+                <w:color w:val="11437E"/>
+                <w:sz w:val="18"/>
+                <w:szCs w:val="18"/>
+              </w:rPr>
+              <w:t>{{ddsnightstart}}</w:t>
+            </w:r>
+          </w:p>
+        </w:tc>
+        <w:tc>
+          <w:tcPr>
+            <w:tcW w:w="2587" w:type="dxa"/>
+          </w:tcPr>
+          <w:p>
+            <w:pPr>
+              <w:rPr>
+                <w:sz w:val="18"/>
+                <w:szCs w:val="18"/>
+              </w:rPr>
+            </w:pPr>
+            <w:r>
+              <w:rPr>
+                <w:b/>
+                <w:bCs/>
+                <w:sz w:val="18"/>
+                <w:szCs w:val="18"/>
+              </w:rPr>
+              <w:t xml:space="preserve">Término: </w:t>
+            </w:r>
+            <w:r>
+              <w:rPr>
+                <w:color w:val="11437E"/>
+                <w:sz w:val="18"/>
+                <w:szCs w:val="18"/>
+              </w:rPr>
+              <w:t>{{ddsnightend}}</w:t>
+            </w:r>
+          </w:p>
+        </w:tc>
+      </w:tr>
+      <w:tr>
+        <w:trPr>
+          <w:trHeight w:val="97"/>
+          <w:jc w:val="center"/>
+        </w:trPr>
+        <w:tc>
+          <w:tcPr>
+            <w:tcW w:w="5174" w:type="dxa"/>
+            <w:gridSpan w:val="2"/>
+          </w:tcPr>
+          <w:p>
+            <w:pPr>
+              <w:rPr>
+                <w:sz w:val="18"/>
+                <w:szCs w:val="18"/>
+              </w:rPr>
+            </w:pPr>
+            <w:r>
+              <w:rPr>
+                <w:b/>
+                <w:bCs/>
+                <w:sz w:val="18"/>
+                <w:szCs w:val="18"/>
+              </w:rPr>
+              <w:t xml:space="preserve">Temas: </w:t>
+            </w:r>
+            <w:r>
+              <w:rPr>
+                <w:color w:val="11437E"/>
+                <w:sz w:val="18"/>
+                <w:szCs w:val="18"/>
+              </w:rPr>
+              <w:t>{{ddsdaythemes}}</w:t>
+            </w:r>
+          </w:p>
+        </w:tc>
+        <w:tc>
+          <w:tcPr>
+            <w:tcW w:w="5174" w:type="dxa"/>
+            <w:gridSpan w:val="2"/>
+          </w:tcPr>
+          <w:p>
+            <w:pPr>
+              <w:rPr>
+                <w:sz w:val="18"/>
+                <w:szCs w:val="18"/>
+              </w:rPr>
+            </w:pPr>
+            <w:r>
+              <w:rPr>
+                <w:b/>
+                <w:bCs/>
+                <w:sz w:val="18"/>
+                <w:szCs w:val="18"/>
+              </w:rPr>
+              <w:t xml:space="preserve">Temas: </w:t>
+            </w:r>
+            <w:r>
+              <w:rPr>
+                <w:color w:val="11437E"/>
+                <w:sz w:val="18"/>
+                <w:szCs w:val="18"/>
+              </w:rPr>
+              <w:t>{{ddsnightthemes}}</w:t>
             </w:r>
           </w:p>
         </w:tc>

</xml_diff>

<commit_message>
Adicionar DDS no RDO (#104)
* docs(spec): document DDS RDO feature

* feat(backend): add DDS themes to RDO

* feat(frontend): add DDS flow to RDO

* feat(reports): add DDS fields to RDO template

* fix(frontend): extract DDS sections from large pages
</commit_message>
<xml_diff>
--- a/Modelos/definitivos/Modelo definitivo.docx
+++ b/Modelos/definitivos/Modelo definitivo.docx
@@ -1204,6 +1204,320 @@
                 <w:szCs w:val="18"/>
               </w:rPr>
               <w:t>}}</w:t>
+            </w:r>
+          </w:p>
+        </w:tc>
+      </w:tr>
+    </w:tbl>
+    <w:p>
+      <w:pPr>
+        <w:jc w:val="both"/>
+        <w:rPr>
+          <w:sz w:val="18"/>
+          <w:szCs w:val="18"/>
+        </w:rPr>
+      </w:pPr>
+    </w:p>
+    <w:tbl>
+      <w:tblPr>
+        <w:tblStyle w:val="Tabelacomgrade"/>
+        <w:tblW w:w="10348" w:type="dxa"/>
+        <w:jc w:val="center"/>
+        <w:tblLayout w:type="fixed"/>
+        <w:tblLook w:val="04A0" w:firstRow="1" w:lastRow="0" w:firstColumn="1" w:lastColumn="0" w:noHBand="0" w:noVBand="1"/>
+      </w:tblPr>
+      <w:tblGrid>
+        <w:gridCol w:w="2587"/>
+        <w:gridCol w:w="2587"/>
+        <w:gridCol w:w="2587"/>
+        <w:gridCol w:w="2587"/>
+      </w:tblGrid>
+      <w:tr>
+        <w:trPr>
+          <w:trHeight w:val="386"/>
+          <w:jc w:val="center"/>
+        </w:trPr>
+        <w:tc>
+          <w:tcPr>
+            <w:tcW w:w="10348" w:type="dxa"/>
+            <w:gridSpan w:val="4"/>
+            <w:shd w:val="clear" w:color="auto" w:fill="30503A"/>
+            <w:vAlign w:val="center"/>
+          </w:tcPr>
+          <w:p>
+            <w:pPr>
+              <w:jc w:val="center"/>
+              <w:rPr>
+                <w:b/>
+                <w:bCs/>
+                <w:color w:val="E8E8E8"/>
+                <w:sz w:val="20"/>
+                <w:szCs w:val="20"/>
+              </w:rPr>
+            </w:pPr>
+            <w:r>
+              <w:rPr>
+                <w:b/>
+                <w:bCs/>
+                <w:color w:val="E8E8E8"/>
+                <w:sz w:val="20"/>
+                <w:szCs w:val="20"/>
+              </w:rPr>
+              <w:t>DDS – DIÁLOGO DIÁRIO DE SEGURANÇA</w:t>
+            </w:r>
+          </w:p>
+        </w:tc>
+      </w:tr>
+      <w:tr>
+        <w:trPr>
+          <w:trHeight w:val="136"/>
+          <w:jc w:val="center"/>
+        </w:trPr>
+        <w:tc>
+          <w:tcPr>
+            <w:tcW w:w="5174" w:type="dxa"/>
+            <w:gridSpan w:val="2"/>
+            <w:shd w:val="clear" w:color="auto" w:fill="E8E8E8"/>
+          </w:tcPr>
+          <w:p>
+            <w:pPr>
+              <w:jc w:val="center"/>
+              <w:rPr>
+                <w:b/>
+                <w:bCs/>
+                <w:sz w:val="18"/>
+                <w:szCs w:val="18"/>
+              </w:rPr>
+            </w:pPr>
+            <w:r>
+              <w:rPr>
+                <w:b/>
+                <w:bCs/>
+                <w:sz w:val="18"/>
+                <w:szCs w:val="18"/>
+              </w:rPr>
+              <w:t>Turno Diurno</w:t>
+            </w:r>
+          </w:p>
+        </w:tc>
+        <w:tc>
+          <w:tcPr>
+            <w:tcW w:w="5174" w:type="dxa"/>
+            <w:gridSpan w:val="2"/>
+            <w:shd w:val="clear" w:color="auto" w:fill="E8E8E8"/>
+          </w:tcPr>
+          <w:p>
+            <w:pPr>
+              <w:jc w:val="center"/>
+              <w:rPr>
+                <w:b/>
+                <w:bCs/>
+                <w:sz w:val="18"/>
+                <w:szCs w:val="18"/>
+              </w:rPr>
+            </w:pPr>
+            <w:r>
+              <w:rPr>
+                <w:b/>
+                <w:bCs/>
+                <w:sz w:val="18"/>
+                <w:szCs w:val="18"/>
+              </w:rPr>
+              <w:t>Turno Noturno</w:t>
+            </w:r>
+          </w:p>
+        </w:tc>
+      </w:tr>
+      <w:tr>
+        <w:trPr>
+          <w:trHeight w:val="97"/>
+          <w:jc w:val="center"/>
+        </w:trPr>
+        <w:tc>
+          <w:tcPr>
+            <w:tcW w:w="2587" w:type="dxa"/>
+          </w:tcPr>
+          <w:p>
+            <w:pPr>
+              <w:rPr>
+                <w:sz w:val="18"/>
+                <w:szCs w:val="18"/>
+              </w:rPr>
+            </w:pPr>
+            <w:r>
+              <w:rPr>
+                <w:b/>
+                <w:bCs/>
+                <w:sz w:val="18"/>
+                <w:szCs w:val="18"/>
+              </w:rPr>
+              <w:t xml:space="preserve">Início: </w:t>
+            </w:r>
+            <w:r>
+              <w:rPr>
+                <w:color w:val="11437E"/>
+                <w:sz w:val="18"/>
+                <w:szCs w:val="18"/>
+              </w:rPr>
+              <w:t>{{ddsdaystart}}</w:t>
+            </w:r>
+          </w:p>
+        </w:tc>
+        <w:tc>
+          <w:tcPr>
+            <w:tcW w:w="2587" w:type="dxa"/>
+          </w:tcPr>
+          <w:p>
+            <w:pPr>
+              <w:rPr>
+                <w:sz w:val="18"/>
+                <w:szCs w:val="18"/>
+              </w:rPr>
+            </w:pPr>
+            <w:r>
+              <w:rPr>
+                <w:b/>
+                <w:bCs/>
+                <w:sz w:val="18"/>
+                <w:szCs w:val="18"/>
+              </w:rPr>
+              <w:t xml:space="preserve">Término: </w:t>
+            </w:r>
+            <w:r>
+              <w:rPr>
+                <w:color w:val="11437E"/>
+                <w:sz w:val="18"/>
+                <w:szCs w:val="18"/>
+              </w:rPr>
+              <w:t>{{ddsdayend}}</w:t>
+            </w:r>
+          </w:p>
+        </w:tc>
+        <w:tc>
+          <w:tcPr>
+            <w:tcW w:w="2587" w:type="dxa"/>
+          </w:tcPr>
+          <w:p>
+            <w:pPr>
+              <w:rPr>
+                <w:sz w:val="18"/>
+                <w:szCs w:val="18"/>
+              </w:rPr>
+            </w:pPr>
+            <w:r>
+              <w:rPr>
+                <w:b/>
+                <w:bCs/>
+                <w:sz w:val="18"/>
+                <w:szCs w:val="18"/>
+              </w:rPr>
+              <w:t xml:space="preserve">Início: </w:t>
+            </w:r>
+            <w:r>
+              <w:rPr>
+                <w:color w:val="11437E"/>
+                <w:sz w:val="18"/>
+                <w:szCs w:val="18"/>
+              </w:rPr>
+              <w:t>{{ddsnightstart}}</w:t>
+            </w:r>
+          </w:p>
+        </w:tc>
+        <w:tc>
+          <w:tcPr>
+            <w:tcW w:w="2587" w:type="dxa"/>
+          </w:tcPr>
+          <w:p>
+            <w:pPr>
+              <w:rPr>
+                <w:sz w:val="18"/>
+                <w:szCs w:val="18"/>
+              </w:rPr>
+            </w:pPr>
+            <w:r>
+              <w:rPr>
+                <w:b/>
+                <w:bCs/>
+                <w:sz w:val="18"/>
+                <w:szCs w:val="18"/>
+              </w:rPr>
+              <w:t xml:space="preserve">Término: </w:t>
+            </w:r>
+            <w:r>
+              <w:rPr>
+                <w:color w:val="11437E"/>
+                <w:sz w:val="18"/>
+                <w:szCs w:val="18"/>
+              </w:rPr>
+              <w:t>{{ddsnightend}}</w:t>
+            </w:r>
+          </w:p>
+        </w:tc>
+      </w:tr>
+      <w:tr>
+        <w:trPr>
+          <w:trHeight w:val="97"/>
+          <w:jc w:val="center"/>
+        </w:trPr>
+        <w:tc>
+          <w:tcPr>
+            <w:tcW w:w="5174" w:type="dxa"/>
+            <w:gridSpan w:val="2"/>
+          </w:tcPr>
+          <w:p>
+            <w:pPr>
+              <w:rPr>
+                <w:sz w:val="18"/>
+                <w:szCs w:val="18"/>
+              </w:rPr>
+            </w:pPr>
+            <w:r>
+              <w:rPr>
+                <w:b/>
+                <w:bCs/>
+                <w:sz w:val="18"/>
+                <w:szCs w:val="18"/>
+              </w:rPr>
+              <w:t xml:space="preserve">Temas: </w:t>
+            </w:r>
+            <w:r>
+              <w:rPr>
+                <w:color w:val="11437E"/>
+                <w:sz w:val="18"/>
+                <w:szCs w:val="18"/>
+              </w:rPr>
+              <w:t>{{ddsdaythemes}}</w:t>
+            </w:r>
+          </w:p>
+        </w:tc>
+        <w:tc>
+          <w:tcPr>
+            <w:tcW w:w="5174" w:type="dxa"/>
+            <w:gridSpan w:val="2"/>
+          </w:tcPr>
+          <w:p>
+            <w:pPr>
+              <w:rPr>
+                <w:sz w:val="18"/>
+                <w:szCs w:val="18"/>
+              </w:rPr>
+            </w:pPr>
+            <w:r>
+              <w:rPr>
+                <w:b/>
+                <w:bCs/>
+                <w:sz w:val="18"/>
+                <w:szCs w:val="18"/>
+              </w:rPr>
+              <w:t xml:space="preserve">Temas: </w:t>
+            </w:r>
+            <w:r>
+              <w:rPr>
+                <w:color w:val="11437E"/>
+                <w:sz w:val="18"/>
+                <w:szCs w:val="18"/>
+              </w:rPr>
+              <w:t>{{ddsnightthemes}}</w:t>
             </w:r>
           </w:p>
         </w:tc>

</xml_diff>